<commit_message>
Update to handle file names with square brackets
Some use square brackets in file names to denote exhibit numbers. Previous version would not process it correctly.
</commit_message>
<xml_diff>
--- a/PDF_Forensics_Technical_Guide.docx
+++ b/PDF_Forensics_Technical_Guide.docx
@@ -173,7 +173,7 @@
           <w:sz w:val="22"/>
           <w:szCs w:val="22"/>
         </w:rPr>
-        <w:t xml:space="preserve">October 14, 2026 · Applies to PDF Forensics Suite v1.0.0, build 2026-10-14</w:t>
+        <w:t xml:space="preserve">October 15, 2026 · Applies to PDF Forensics Suite v1.0.0, build 2026-10-15</w:t>
       </w:r>
     </w:p>
     <w:p>
@@ -31605,7 +31605,7 @@
         <w:sz w:val="18"/>
         <w:szCs w:val="18"/>
       </w:rPr>
-      <w:t xml:space="preserve">	PDF Forensics Suite v1.0.0 · build 2026-10-14 — October 2026</w:t>
+      <w:t xml:space="preserve">	PDF Forensics Suite v1.0.0 · build 2026-10-15 — October 2026</w:t>
     </w:r>
   </w:p>
 </w:ftr>

</xml_diff>